<commit_message>
privacy: align binding policy + correct dossier to as-deployed notice (app PR #3215)
Binding Setnayan_Privacy_and_Security_Policy: dpo@ email, 15-day SLA, 10-yr
retention floor (payments/OR + contracts) + e-gift row, +Google/TikTok/Suno
subprocessors, dated amendment. Flag (not change) the stale §A.5 minors line
for counsel. Correct dossier v2.0 §1/§4/§5/§11: the live notice already carried
biometric + device-identifier sections (earlier finding was a stale checkout);
notice PR #3215 added faith/family/honoree/e-gift + Anthropic/Suno.

Co-Authored-By: Claude Opus 4.8 <noreply@anthropic.com>
</commit_message>
<xml_diff>
--- a/NPC_Privacy_Compliance_Dossier_2026-07-12.docx
+++ b/NPC_Privacy_Compliance_Dossier_2026-07-12.docx
@@ -552,26 +552,57 @@
                 <w:b/>
                 <w:bCs/>
               </w:rPr>
-              <w:t xml:space="preserve">currently last updated 2026-07-04</w:t>
-            </w:r>
-            <w:r>
-              <w:t xml:space="preserve">). The notice update that adds the faith / minors / e-gift disclosures and corrects the biometric line described in this dossier is</w:t>
-            </w:r>
-            <w:r>
-              <w:t xml:space="preserve"> </w:t>
-            </w:r>
-            <w:r>
-              <w:rPr>
-                <w:b/>
-                <w:bCs/>
-              </w:rPr>
-              <w:t xml:space="preserve">pending</w:t>
-            </w:r>
-            <w:r>
-              <w:t xml:space="preserve"> </w:t>
-            </w:r>
-            <w:r>
-              <w:t xml:space="preserve">— see §11.</w:t>
+              <w:t xml:space="preserve">last updated 2026-07-13</w:t>
+            </w:r>
+            <w:r>
+              <w:t xml:space="preserve"> </w:t>
+            </w:r>
+            <w:r>
+              <w:t xml:space="preserve">via app PR #3215, adding the faith / family / honoree / e-gift disclosures + Anthropic/Suno subprocessors). The opt-in</w:t>
+            </w:r>
+            <w:r>
+              <w:t xml:space="preserve"> </w:t>
+            </w:r>
+            <w:r>
+              <w:rPr>
+                <w:b/>
+                <w:bCs/>
+              </w:rPr>
+              <w:t xml:space="preserve">biometric</w:t>
+            </w:r>
+            <w:r>
+              <w:t xml:space="preserve"> </w:t>
+            </w:r>
+            <w:r>
+              <w:t xml:space="preserve">and</w:t>
+            </w:r>
+            <w:r>
+              <w:t xml:space="preserve"> </w:t>
+            </w:r>
+            <w:r>
+              <w:rPr>
+                <w:b/>
+                <w:bCs/>
+              </w:rPr>
+              <w:t xml:space="preserve">device-identifier</w:t>
+            </w:r>
+            <w:r>
+              <w:t xml:space="preserve"> </w:t>
+            </w:r>
+            <w:r>
+              <w:t xml:space="preserve">sections were already present on</w:t>
+            </w:r>
+            <w:r>
+              <w:t xml:space="preserve"> </w:t>
+            </w:r>
+            <w:r>
+              <w:rPr>
+                <w:rStyle w:val="VerbatimChar"/>
+              </w:rPr>
+              <w:t xml:space="preserve">origin/main</w:t>
+            </w:r>
+            <w:r>
+              <w:t xml:space="preserve">.</w:t>
             </w:r>
           </w:p>
         </w:tc>
@@ -3565,23 +3596,29 @@
               <w:pStyle w:val="Compact"/>
             </w:pPr>
             <w:r>
-              <w:t xml:space="preserve">To be disclosed in the public privacy notice</w:t>
-            </w:r>
-            <w:r>
-              <w:t xml:space="preserve"> </w:t>
-            </w:r>
-            <w:r>
-              <w:rPr>
-                <w:b/>
-                <w:bCs/>
-              </w:rPr>
-              <w:t xml:space="preserve">before</w:t>
-            </w:r>
-            <w:r>
-              <w:t xml:space="preserve"> </w:t>
-            </w:r>
-            <w:r>
-              <w:t xml:space="preserve">activation (disclosure pending — §11)</w:t>
+              <w:rPr>
+                <w:b/>
+                <w:bCs/>
+              </w:rPr>
+              <w:t xml:space="preserve">Already disclosed</w:t>
+            </w:r>
+            <w:r>
+              <w:t xml:space="preserve"> </w:t>
+            </w:r>
+            <w:r>
+              <w:t xml:space="preserve">in the public privacy notice (the</w:t>
+            </w:r>
+            <w:r>
+              <w:t xml:space="preserve"> </w:t>
+            </w:r>
+            <w:r>
+              <w:t xml:space="preserve">“Device identifier (fraud prevention)”</w:t>
+            </w:r>
+            <w:r>
+              <w:t xml:space="preserve"> </w:t>
+            </w:r>
+            <w:r>
+              <w:t xml:space="preserve">section), ahead of activation</w:t>
             </w:r>
           </w:p>
         </w:tc>
@@ -3670,7 +3707,7 @@
         <w:t xml:space="preserve">LOW</w:t>
       </w:r>
       <w:r>
-        <w:t xml:space="preserve">. The remaining gates are (a) the privacy-notice disclosure and (b) the DPO’s activation decision.</w:t>
+        <w:t xml:space="preserve">. The privacy-notice disclosure is already published; the remaining gate is the DPO’s activation decision.</w:t>
       </w:r>
     </w:p>
     <w:p>
@@ -4328,53 +4365,114 @@
           <w:b/>
           <w:bCs/>
         </w:rPr>
-        <w:t xml:space="preserve">v2.0 correction:</w:t>
-      </w:r>
-      <w:r>
-        <w:t xml:space="preserve"> </w:t>
-      </w:r>
-      <w:r>
-        <w:t xml:space="preserve">the biometric line in the public notice currently reads that Setnayan does</w:t>
-      </w:r>
-      <w:r>
-        <w:t xml:space="preserve"> </w:t>
-      </w:r>
-      <w:r>
-        <w:rPr>
-          <w:b/>
-          <w:bCs/>
-        </w:rPr>
-        <w:t xml:space="preserve">not</w:t>
-      </w:r>
-      <w:r>
-        <w:t xml:space="preserve"> </w:t>
-      </w:r>
-      <w:r>
-        <w:t xml:space="preserve">collect</w:t>
-      </w:r>
-      <w:r>
-        <w:t xml:space="preserve"> </w:t>
-      </w:r>
-      <w:r>
-        <w:t xml:space="preserve">“face biometrics or any other biometric data.”</w:t>
-      </w:r>
-      <w:r>
-        <w:t xml:space="preserve"> </w:t>
-      </w:r>
-      <w:r>
-        <w:t xml:space="preserve">Because an opt-in face-enrolment feature and its consent flow exist (vector storage dormant, image-only today), that flat denial is to be revised to an accurate</w:t>
-      </w:r>
-      <w:r>
-        <w:t xml:space="preserve"> </w:t>
-      </w:r>
-      <w:r>
-        <w:t xml:space="preserve">“optional, opt-in, per-event, currently image-only”</w:t>
-      </w:r>
-      <w:r>
-        <w:t xml:space="preserve"> </w:t>
-      </w:r>
-      <w:r>
-        <w:t xml:space="preserve">statement before the notice republishes — §11.</w:t>
+        <w:t xml:space="preserve">Note (2026-07-13):</w:t>
+      </w:r>
+      <w:r>
+        <w:t xml:space="preserve"> </w:t>
+      </w:r>
+      <w:r>
+        <w:t xml:space="preserve">the public notice</w:t>
+      </w:r>
+      <w:r>
+        <w:t xml:space="preserve"> </w:t>
+      </w:r>
+      <w:r>
+        <w:rPr>
+          <w:b/>
+          <w:bCs/>
+        </w:rPr>
+        <w:t xml:space="preserve">already</w:t>
+      </w:r>
+      <w:r>
+        <w:t xml:space="preserve"> </w:t>
+      </w:r>
+      <w:r>
+        <w:t xml:space="preserve">carries an accurate opt-in</w:t>
+      </w:r>
+      <w:r>
+        <w:t xml:space="preserve"> </w:t>
+      </w:r>
+      <w:r>
+        <w:rPr>
+          <w:b/>
+          <w:bCs/>
+        </w:rPr>
+        <w:t xml:space="preserve">Biometric data (facial recognition)</w:t>
+      </w:r>
+      <w:r>
+        <w:t xml:space="preserve"> </w:t>
+      </w:r>
+      <w:r>
+        <w:t xml:space="preserve">section (explicit consent, adults 18+, per-event scope, withdrawal → permanent deletion) and a</w:t>
+      </w:r>
+      <w:r>
+        <w:t xml:space="preserve"> </w:t>
+      </w:r>
+      <w:r>
+        <w:rPr>
+          <w:b/>
+          <w:bCs/>
+        </w:rPr>
+        <w:t xml:space="preserve">Device identifier (fraud prevention)</w:t>
+      </w:r>
+      <w:r>
+        <w:t xml:space="preserve"> </w:t>
+      </w:r>
+      <w:r>
+        <w:t xml:space="preserve">section — the earlier</w:t>
+      </w:r>
+      <w:r>
+        <w:t xml:space="preserve"> </w:t>
+      </w:r>
+      <w:r>
+        <w:t xml:space="preserve">“notice denies biometrics / omits the device identifier”</w:t>
+      </w:r>
+      <w:r>
+        <w:t xml:space="preserve"> </w:t>
+      </w:r>
+      <w:r>
+        <w:t xml:space="preserve">concern came from a</w:t>
+      </w:r>
+      <w:r>
+        <w:t xml:space="preserve"> </w:t>
+      </w:r>
+      <w:r>
+        <w:rPr>
+          <w:b/>
+          <w:bCs/>
+        </w:rPr>
+        <w:t xml:space="preserve">stale local checkout</w:t>
+      </w:r>
+      <w:r>
+        <w:t xml:space="preserve">, not the deployed</w:t>
+      </w:r>
+      <w:r>
+        <w:t xml:space="preserve"> </w:t>
+      </w:r>
+      <w:r>
+        <w:rPr>
+          <w:rStyle w:val="VerbatimChar"/>
+        </w:rPr>
+        <w:t xml:space="preserve">origin/main</w:t>
+      </w:r>
+      <w:r>
+        <w:t xml:space="preserve">. Face-vector storage is currently</w:t>
+      </w:r>
+      <w:r>
+        <w:t xml:space="preserve"> </w:t>
+      </w:r>
+      <w:r>
+        <w:rPr>
+          <w:b/>
+          <w:bCs/>
+        </w:rPr>
+        <w:t xml:space="preserve">dormant</w:t>
+      </w:r>
+      <w:r>
+        <w:t xml:space="preserve"> </w:t>
+      </w:r>
+      <w:r>
+        <w:t xml:space="preserve">(enrolment image-only until the matching model activates), which the section’s opt-in framing already accommodates.</w:t>
       </w:r>
     </w:p>
     <w:p>
@@ -5815,51 +5913,61 @@
           <w:b/>
           <w:bCs/>
         </w:rPr>
-        <w:t xml:space="preserve">Reconcile the public privacy notice</w:t>
-      </w:r>
-      <w:r>
-        <w:t xml:space="preserve"> </w:t>
-      </w:r>
-      <w:r>
-        <w:t xml:space="preserve">(</w:t>
-      </w:r>
-      <w:r>
-        <w:rPr>
-          <w:rStyle w:val="VerbatimChar"/>
-        </w:rPr>
-        <w:t xml:space="preserve">setnayan.com/privacy</w:t>
-      </w:r>
-      <w:r>
-        <w:t xml:space="preserve">) to this dossier before or alongside filing: add disclosures for</w:t>
-      </w:r>
-      <w:r>
-        <w:t xml:space="preserve"> </w:t>
-      </w:r>
-      <w:r>
-        <w:rPr>
-          <w:b/>
-          <w:bCs/>
-        </w:rPr>
-        <w:t xml:space="preserve">faith/ceremony data, minors’/dependents’ data, e-gift receiving handles, and the device fingerprint (pre-activation)</w:t>
-      </w:r>
-      <w:r>
-        <w:t xml:space="preserve">; and</w:t>
-      </w:r>
-      <w:r>
-        <w:t xml:space="preserve"> </w:t>
-      </w:r>
-      <w:r>
-        <w:rPr>
-          <w:b/>
-          <w:bCs/>
-        </w:rPr>
-        <w:t xml:space="preserve">correct the biometric line</w:t>
-      </w:r>
-      <w:r>
-        <w:t xml:space="preserve"> </w:t>
-      </w:r>
-      <w:r>
-        <w:t xml:space="preserve">from a flat denial to the accurate opt-in/image-only statement (§5).</w:t>
+        <w:t xml:space="preserve">Public privacy notice — DONE (app PR #3215, 2026-07-13):</w:t>
+      </w:r>
+      <w:r>
+        <w:t xml:space="preserve"> </w:t>
+      </w:r>
+      <w:r>
+        <w:t xml:space="preserve">added the</w:t>
+      </w:r>
+      <w:r>
+        <w:t xml:space="preserve"> </w:t>
+      </w:r>
+      <w:r>
+        <w:rPr>
+          <w:b/>
+          <w:bCs/>
+        </w:rPr>
+        <w:t xml:space="preserve">faith / family / honoree / e-gift</w:t>
+      </w:r>
+      <w:r>
+        <w:t xml:space="preserve"> </w:t>
+      </w:r>
+      <w:r>
+        <w:t xml:space="preserve">disclosures + Anthropic/Suno subprocessors; the opt-in</w:t>
+      </w:r>
+      <w:r>
+        <w:t xml:space="preserve"> </w:t>
+      </w:r>
+      <w:r>
+        <w:rPr>
+          <w:b/>
+          <w:bCs/>
+        </w:rPr>
+        <w:t xml:space="preserve">biometric</w:t>
+      </w:r>
+      <w:r>
+        <w:t xml:space="preserve"> </w:t>
+      </w:r>
+      <w:r>
+        <w:t xml:space="preserve">and</w:t>
+      </w:r>
+      <w:r>
+        <w:t xml:space="preserve"> </w:t>
+      </w:r>
+      <w:r>
+        <w:rPr>
+          <w:b/>
+          <w:bCs/>
+        </w:rPr>
+        <w:t xml:space="preserve">device-identifier</w:t>
+      </w:r>
+      <w:r>
+        <w:t xml:space="preserve"> </w:t>
+      </w:r>
+      <w:r>
+        <w:t xml:space="preserve">sections were already present. Remaining notice work is wording refinement by counsel, not a coverage gap.</w:t>
       </w:r>
       <w:r>
         <w:t xml:space="preserve"> </w:t>

</xml_diff>

<commit_message>
docs: flush pending corpus — NPC adoption set, DPO/DSR reconciliation, prototypes, verdicts
Commit the corpus work accumulated across prior sessions so the tree is clean:
- NPC_Compliance: adopted (signature-ready) Privacy Manual / DPO+NPCRS / Breach Policy + adoption cover sheet; DPO contact reconciled to iscasasolaii@gmail.com and DSR SLA to 15 business days across manual/RoPA/DPO sheet + dossier (.md/.docx/PDF mirrors).
- New corpus docs: NPC_Filing_Status_and_Action_Sheet, Negotiation_Exchange + Vendor_Value_Proposition, council verdicts, 5-tab guest-site prototype, 3D avatar/chibi prototypes, atelier-glass design handoff.
- WIP_Rescue_Patches + prototypes archives; misc updates (AS_BUILT, Pricing.docx, Data_Retention_Schedule, 3D plan model, session resume).

Hygiene: gitignore supabase/.temp/ (machine-local) and backups/ (prod orders/payments/receipts data — never push, RA 10173); untrack the temp files.

Co-Authored-By: Claude Opus 4.8 <noreply@anthropic.com>
</commit_message>
<xml_diff>
--- a/NPC_Privacy_Compliance_Dossier_2026-07-12.docx
+++ b/NPC_Privacy_Compliance_Dossier_2026-07-12.docx
@@ -1687,13 +1687,13 @@
                 <w:b/>
                 <w:bCs/>
               </w:rPr>
-              <w:t xml:space="preserve">Gated</w:t>
-            </w:r>
-            <w:r>
-              <w:t xml:space="preserve"> </w:t>
-            </w:r>
-            <w:r>
-              <w:t xml:space="preserve">by</w:t>
+              <w:t xml:space="preserve">Enabled in production</w:t>
+            </w:r>
+            <w:r>
+              <w:t xml:space="preserve"> </w:t>
+            </w:r>
+            <w:r>
+              <w:t xml:space="preserve">(owner/DPO flipped</w:t>
             </w:r>
             <w:r>
               <w:t xml:space="preserve"> </w:t>
@@ -1705,7 +1705,42 @@
               <w:t xml:space="preserve">NEXT_PUBLIC_DEPENDENT_PEOPLE</w:t>
             </w:r>
             <w:r>
-              <w:t xml:space="preserve">; reported enabled in production (2026-07-13)</w:t>
+              <w:t xml:space="preserve"> </w:t>
+            </w:r>
+            <w:r>
+              <w:t xml:space="preserve">2026-07-16).</w:t>
+            </w:r>
+            <w:r>
+              <w:t xml:space="preserve"> </w:t>
+            </w:r>
+            <w:r>
+              <w:rPr>
+                <w:b/>
+                <w:bCs/>
+              </w:rPr>
+              <w:t xml:space="preserve">Ownership transfer at majority (2026-07-16/17):</w:t>
+            </w:r>
+            <w:r>
+              <w:t xml:space="preserve"> </w:t>
+            </w:r>
+            <w:r>
+              <w:t xml:space="preserve">a person-dependent’s record can be CLAIMED by the data subject at 18 (RA 6809 age of majority — 18 for both sexes, distinct from the 18F/21M debut celebration ladder) via a single-use, 7-day, guardian-revocable link (bearer token; excluded from data exports; optionally emailed to a recipient address that is used once and stored nowhere). On claim,</w:t>
+            </w:r>
+            <w:r>
+              <w:t xml:space="preserve"> </w:t>
+            </w:r>
+            <w:r>
+              <w:rPr>
+                <w:b/>
+                <w:bCs/>
+              </w:rPr>
+              <w:t xml:space="preserve">ownership of the record moves to the data subject</w:t>
+            </w:r>
+            <w:r>
+              <w:t xml:space="preserve"> </w:t>
+            </w:r>
+            <w:r>
+              <w:t xml:space="preserve">— they gain full control including erasure; the former guardian retains read-only history; the record thereafter survives the guardian’s account deletion and is deleted with the SUBJECT’s account. Elders (already past majority) are claim-eligible from day one. Pet/other records never convert to an account; care can only be reassigned guardian→guardian. Godparent edges transfer with the claimed record.</w:t>
             </w:r>
           </w:p>
         </w:tc>
@@ -2325,7 +2360,23 @@
               <w:pStyle w:val="Compact"/>
             </w:pPr>
             <w:r>
-              <w:t xml:space="preserve">Per-event only; revocable on request; purged with media (≤5y)</w:t>
+              <w:t xml:space="preserve">Per-event only; never reused across events; revocable on request.</w:t>
+            </w:r>
+            <w:r>
+              <w:t xml:space="preserve"> </w:t>
+            </w:r>
+            <w:r>
+              <w:rPr>
+                <w:b/>
+                <w:bCs/>
+              </w:rPr>
+              <w:t xml:space="preserve">Facial-geometry vector auto-expired (nulled) at ~5 years</w:t>
+            </w:r>
+            <w:r>
+              <w:t xml:space="preserve"> </w:t>
+            </w:r>
+            <w:r>
+              <w:t xml:space="preserve">by a scheduled per-event sweep (anchor = later of event date / enrolment); the underlying photo is retained. Selfie-asset purge-at-expiry is a DPO decision — §11</w:t>
             </w:r>
           </w:p>
         </w:tc>
@@ -2346,7 +2397,7 @@
               <w:t xml:space="preserve"> </w:t>
             </w:r>
             <w:r>
-              <w:t xml:space="preserve">(enrolment currently image-only until the matching model is activated) — see §5</w:t>
+              <w:t xml:space="preserve">(enrolment image-only until the matching model activates) — see §5</w:t>
             </w:r>
           </w:p>
         </w:tc>
@@ -3083,6 +3134,393 @@
             </w:pPr>
             <w:r>
               <w:t xml:space="preserve">Active</w:t>
+            </w:r>
+          </w:p>
+        </w:tc>
+      </w:tr>
+      <w:tr>
+        <w:tc>
+          <w:tcPr/>
+          <w:p>
+            <w:pPr>
+              <w:pStyle w:val="Compact"/>
+            </w:pPr>
+            <w:r>
+              <w:t xml:space="preserve">19</w:t>
+            </w:r>
+          </w:p>
+        </w:tc>
+        <w:tc>
+          <w:tcPr/>
+          <w:p>
+            <w:pPr>
+              <w:pStyle w:val="Compact"/>
+            </w:pPr>
+            <w:r>
+              <w:rPr>
+                <w:b/>
+                <w:bCs/>
+              </w:rPr>
+              <w:t xml:space="preserve">Samahan (group) memberships</w:t>
+            </w:r>
+            <w:r>
+              <w:t xml:space="preserve"> </w:t>
+            </w:r>
+            <w:r>
+              <w:t xml:space="preserve">— the group’s</w:t>
+            </w:r>
+            <w:r>
+              <w:t xml:space="preserve"> </w:t>
+            </w:r>
+            <w:r>
+              <w:rPr>
+                <w:b/>
+                <w:bCs/>
+              </w:rPr>
+              <w:t xml:space="preserve">user-chosen name</w:t>
+            </w:r>
+            <w:r>
+              <w:t xml:space="preserve">, optional description, the member’s role (organizer/member), join date, and a rotating invite token.</w:t>
+            </w:r>
+            <w:r>
+              <w:t xml:space="preserve"> </w:t>
+            </w:r>
+            <w:r>
+              <w:rPr>
+                <w:b/>
+                <w:bCs/>
+              </w:rPr>
+              <w:t xml:space="preserve">No classification/category field exists by design</w:t>
+            </w:r>
+            <w:r>
+              <w:t xml:space="preserve"> </w:t>
+            </w:r>
+            <w:r>
+              <w:t xml:space="preserve">(owner 2026-07-17): the platform never labels a group’s nature or affiliation — the old</w:t>
+            </w:r>
+            <w:r>
+              <w:t xml:space="preserve"> </w:t>
+            </w:r>
+            <w:r>
+              <w:rPr>
+                <w:rStyle w:val="VerbatimChar"/>
+              </w:rPr>
+              <w:t xml:space="preserve">kind</w:t>
+            </w:r>
+            <w:r>
+              <w:t xml:space="preserve"> </w:t>
+            </w:r>
+            <w:r>
+              <w:t xml:space="preserve">taxonomy (which included</w:t>
+            </w:r>
+            <w:r>
+              <w:t xml:space="preserve"> </w:t>
+            </w:r>
+            <w:r>
+              <w:rPr>
+                <w:rStyle w:val="VerbatimChar"/>
+              </w:rPr>
+              <w:t xml:space="preserve">parish</w:t>
+            </w:r>
+            <w:r>
+              <w:t xml:space="preserve">, a religious-affiliation signal) was</w:t>
+            </w:r>
+            <w:r>
+              <w:t xml:space="preserve"> </w:t>
+            </w:r>
+            <w:r>
+              <w:rPr>
+                <w:b/>
+                <w:bCs/>
+              </w:rPr>
+              <w:t xml:space="preserve">removed at the schema level</w:t>
+            </w:r>
+            <w:r>
+              <w:t xml:space="preserve">, so no query, export, or breach can enumerate members by group type. A group’s free-text name is the group’s own speech, not a platform-assigned category</w:t>
+            </w:r>
+          </w:p>
+        </w:tc>
+        <w:tc>
+          <w:tcPr/>
+          <w:p>
+            <w:pPr>
+              <w:pStyle w:val="Compact"/>
+            </w:pPr>
+            <w:r>
+              <w:t xml:space="preserve">Account holders who create or join a samahan</w:t>
+            </w:r>
+          </w:p>
+        </w:tc>
+        <w:tc>
+          <w:tcPr/>
+          <w:p>
+            <w:pPr>
+              <w:pStyle w:val="Compact"/>
+            </w:pPr>
+            <w:r>
+              <w:t xml:space="preserve">User-initiated group formation (barkada/clan/org/etc. as THEY name it); rosters visible to fellow members only</w:t>
+            </w:r>
+          </w:p>
+        </w:tc>
+        <w:tc>
+          <w:tcPr/>
+          <w:p>
+            <w:pPr>
+              <w:pStyle w:val="Compact"/>
+            </w:pPr>
+            <w:r>
+              <w:t xml:space="preserve">§ 12(b) contract (user-initiated membership)</w:t>
+            </w:r>
+          </w:p>
+        </w:tc>
+        <w:tc>
+          <w:tcPr/>
+          <w:p>
+            <w:pPr>
+              <w:pStyle w:val="Compact"/>
+            </w:pPr>
+            <w:r>
+              <w:t xml:space="preserve">Membership row deleted on leaving the group or account deletion; included in the data export (</w:t>
+            </w:r>
+            <w:r>
+              <w:rPr>
+                <w:rStyle w:val="VerbatimChar"/>
+              </w:rPr>
+              <w:t xml:space="preserve">samahan_memberships</w:t>
+            </w:r>
+            <w:r>
+              <w:t xml:space="preserve">)</w:t>
+            </w:r>
+          </w:p>
+        </w:tc>
+        <w:tc>
+          <w:tcPr/>
+          <w:p>
+            <w:pPr>
+              <w:pStyle w:val="Compact"/>
+            </w:pPr>
+            <w:r>
+              <w:t xml:space="preserve">Active (live product); disclosed in the privacy notice</w:t>
+            </w:r>
+            <w:r>
+              <w:t xml:space="preserve"> </w:t>
+            </w:r>
+            <w:r>
+              <w:t xml:space="preserve">“Samahan (groups)”</w:t>
+            </w:r>
+            <w:r>
+              <w:t xml:space="preserve"> </w:t>
+            </w:r>
+            <w:r>
+              <w:t xml:space="preserve">section (2026-07-17)</w:t>
+            </w:r>
+          </w:p>
+        </w:tc>
+      </w:tr>
+      <w:tr>
+        <w:tc>
+          <w:tcPr/>
+          <w:p>
+            <w:pPr>
+              <w:pStyle w:val="Compact"/>
+            </w:pPr>
+            <w:r>
+              <w:t xml:space="preserve">20</w:t>
+            </w:r>
+          </w:p>
+        </w:tc>
+        <w:tc>
+          <w:tcPr/>
+          <w:p>
+            <w:pPr>
+              <w:pStyle w:val="Compact"/>
+            </w:pPr>
+            <w:r>
+              <w:rPr>
+                <w:b/>
+                <w:bCs/>
+              </w:rPr>
+              <w:t xml:space="preserve">Papic Lite — open/crowd photo capture</w:t>
+            </w:r>
+            <w:r>
+              <w:t xml:space="preserve"> </w:t>
+            </w:r>
+            <w:r>
+              <w:t xml:space="preserve">(public-event QR;</w:t>
+            </w:r>
+            <w:r>
+              <w:t xml:space="preserve"> </w:t>
+            </w:r>
+            <w:r>
+              <w:rPr>
+                <w:b/>
+                <w:bCs/>
+              </w:rPr>
+              <w:t xml:space="preserve">photos only, no video, biometric-free — no facial-geometry vectors</w:t>
+            </w:r>
+            <w:r>
+              <w:t xml:space="preserve">). A shared photo pool for a large public event; captures</w:t>
+            </w:r>
+            <w:r>
+              <w:t xml:space="preserve"> </w:t>
+            </w:r>
+            <w:r>
+              <w:rPr>
+                <w:b/>
+                <w:bCs/>
+              </w:rPr>
+              <w:t xml:space="preserve">photographs that may include non-participant bystanders</w:t>
+            </w:r>
+            <w:r>
+              <w:t xml:space="preserve">; optional participant</w:t>
+            </w:r>
+            <w:r>
+              <w:t xml:space="preserve"> </w:t>
+            </w:r>
+            <w:r>
+              <w:rPr>
+                <w:b/>
+                <w:bCs/>
+              </w:rPr>
+              <w:t xml:space="preserve">join email</w:t>
+            </w:r>
+            <w:r>
+              <w:t xml:space="preserve"> </w:t>
+            </w:r>
+            <w:r>
+              <w:t xml:space="preserve">(magic-link claim) + consent timestamp + device/IP-hash (Sybil control)</w:t>
+            </w:r>
+          </w:p>
+        </w:tc>
+        <w:tc>
+          <w:tcPr/>
+          <w:p>
+            <w:pPr>
+              <w:pStyle w:val="Compact"/>
+            </w:pPr>
+            <w:r>
+              <w:t xml:space="preserve">Public-event attendees + bystanders; the hosting organizer (controller of the pool)</w:t>
+            </w:r>
+          </w:p>
+        </w:tc>
+        <w:tc>
+          <w:tcPr/>
+          <w:p>
+            <w:pPr>
+              <w:pStyle w:val="Compact"/>
+            </w:pPr>
+            <w:r>
+              <w:t xml:space="preserve">Let a host collect one shared photo pool for a public/large event (concert, tournament, corporate); each joiner keeps their own shots</w:t>
+            </w:r>
+          </w:p>
+        </w:tc>
+        <w:tc>
+          <w:tcPr/>
+          <w:p>
+            <w:pPr>
+              <w:pStyle w:val="Compact"/>
+            </w:pPr>
+            <w:r>
+              <w:t xml:space="preserve">§ 12(b) contract (host); § 12(a) join-consent (participants); bystander images on a public-space + posted-host-notice basis</w:t>
+            </w:r>
+            <w:r>
+              <w:t xml:space="preserve"> </w:t>
+            </w:r>
+            <w:r>
+              <w:rPr>
+                <w:i/>
+                <w:iCs/>
+              </w:rPr>
+              <w:t xml:space="preserve">(counsel)</w:t>
+            </w:r>
+          </w:p>
+        </w:tc>
+        <w:tc>
+          <w:tcPr/>
+          <w:p>
+            <w:pPr>
+              <w:pStyle w:val="Compact"/>
+            </w:pPr>
+            <w:r>
+              <w:t xml:space="preserve">Full-res 6-month window then dropped; compressed gallery ≤5y.</w:t>
+            </w:r>
+            <w:r>
+              <w:t xml:space="preserve"> </w:t>
+            </w:r>
+            <w:r>
+              <w:rPr>
+                <w:b/>
+                <w:bCs/>
+              </w:rPr>
+              <w:t xml:space="preserve">Erasure = a public takedown/complaint form</w:t>
+            </w:r>
+            <w:r>
+              <w:t xml:space="preserve"> </w:t>
+            </w:r>
+            <w:r>
+              <w:t xml:space="preserve">(routes to host + admin) — the subject-access mechanism</w:t>
+            </w:r>
+            <w:r>
+              <w:t xml:space="preserve"> </w:t>
+            </w:r>
+            <w:r>
+              <w:rPr>
+                <w:i/>
+                <w:iCs/>
+              </w:rPr>
+              <w:t xml:space="preserve">because Lite has no face-search</w:t>
+            </w:r>
+          </w:p>
+        </w:tc>
+        <w:tc>
+          <w:tcPr/>
+          <w:p>
+            <w:pPr>
+              <w:pStyle w:val="Compact"/>
+            </w:pPr>
+            <w:r>
+              <w:rPr>
+                <w:b/>
+                <w:bCs/>
+              </w:rPr>
+              <w:t xml:space="preserve">Gated</w:t>
+            </w:r>
+            <w:r>
+              <w:t xml:space="preserve"> </w:t>
+            </w:r>
+            <w:r>
+              <w:t xml:space="preserve">—</w:t>
+            </w:r>
+            <w:r>
+              <w:t xml:space="preserve"> </w:t>
+            </w:r>
+            <w:r>
+              <w:rPr>
+                <w:rStyle w:val="VerbatimChar"/>
+              </w:rPr>
+              <w:t xml:space="preserve">NEXT_PUBLIC_PAPIC_LITE_ENABLED</w:t>
+            </w:r>
+            <w:r>
+              <w:t xml:space="preserve"> </w:t>
+            </w:r>
+            <w:r>
+              <w:t xml:space="preserve">OFF in production; collects nothing until enabled,</w:t>
+            </w:r>
+            <w:r>
+              <w:t xml:space="preserve"> </w:t>
+            </w:r>
+            <w:r>
+              <w:rPr>
+                <w:b/>
+                <w:bCs/>
+              </w:rPr>
+              <w:t xml:space="preserve">blocked on DPO + external-counsel sign-off + a CSAM matcher</w:t>
+            </w:r>
+            <w:r>
+              <w:t xml:space="preserve"> </w:t>
+            </w:r>
+            <w:r>
+              <w:t xml:space="preserve">(see §11)</w:t>
             </w:r>
           </w:p>
         </w:tc>
@@ -5356,6 +5794,118 @@
           </w:p>
         </w:tc>
       </w:tr>
+      <w:tr>
+        <w:tc>
+          <w:tcPr/>
+          <w:p>
+            <w:pPr>
+              <w:pStyle w:val="Compact"/>
+            </w:pPr>
+            <w:r>
+              <w:t xml:space="preserve">Backblaze B2</w:t>
+            </w:r>
+          </w:p>
+        </w:tc>
+        <w:tc>
+          <w:tcPr/>
+          <w:p>
+            <w:pPr>
+              <w:pStyle w:val="Compact"/>
+            </w:pPr>
+            <w:r>
+              <w:t xml:space="preserve">Cold object storage — Papic compressed-gallery cold tier at scale</w:t>
+            </w:r>
+          </w:p>
+        </w:tc>
+        <w:tc>
+          <w:tcPr/>
+          <w:p>
+            <w:pPr>
+              <w:pStyle w:val="Compact"/>
+            </w:pPr>
+            <w:r>
+              <w:t xml:space="preserve">United States</w:t>
+            </w:r>
+          </w:p>
+        </w:tc>
+        <w:tc>
+          <w:tcPr/>
+          <w:p>
+            <w:pPr>
+              <w:pStyle w:val="Compact"/>
+            </w:pPr>
+            <w:r>
+              <w:rPr>
+                <w:b/>
+                <w:bCs/>
+              </w:rPr>
+              <w:t xml:space="preserve">Not yet active</w:t>
+            </w:r>
+            <w:r>
+              <w:t xml:space="preserve"> </w:t>
+            </w:r>
+            <w:r>
+              <w:t xml:space="preserve">— flag-gated; engaged only once the aggregate cold pile reaches ~tens of TB</w:t>
+            </w:r>
+          </w:p>
+        </w:tc>
+      </w:tr>
+      <w:tr>
+        <w:tc>
+          <w:tcPr/>
+          <w:p>
+            <w:pPr>
+              <w:pStyle w:val="Compact"/>
+            </w:pPr>
+            <w:r>
+              <w:t xml:space="preserve">CSAM hash-matching provider (e.g. PhotoDNA / NCMEC)</w:t>
+            </w:r>
+          </w:p>
+        </w:tc>
+        <w:tc>
+          <w:tcPr/>
+          <w:p>
+            <w:pPr>
+              <w:pStyle w:val="Compact"/>
+            </w:pPr>
+            <w:r>
+              <w:t xml:space="preserve">Known-illegal-image hash matching for Papic Lite public capture</w:t>
+            </w:r>
+          </w:p>
+        </w:tc>
+        <w:tc>
+          <w:tcPr/>
+          <w:p>
+            <w:pPr>
+              <w:pStyle w:val="Compact"/>
+            </w:pPr>
+            <w:r>
+              <w:t xml:space="preserve">United States</w:t>
+            </w:r>
+          </w:p>
+        </w:tc>
+        <w:tc>
+          <w:tcPr/>
+          <w:p>
+            <w:pPr>
+              <w:pStyle w:val="Compact"/>
+            </w:pPr>
+            <w:r>
+              <w:rPr>
+                <w:b/>
+                <w:bCs/>
+              </w:rPr>
+              <w:t xml:space="preserve">Not yet engaged</w:t>
+            </w:r>
+            <w:r>
+              <w:t xml:space="preserve"> </w:t>
+            </w:r>
+            <w:r>
+              <w:t xml:space="preserve">— required before Papic Lite public launch; mandatory-reporting duty to be reviewed by counsel</w:t>
+            </w:r>
+          </w:p>
+        </w:tc>
+      </w:tr>
     </w:tbl>
     <w:p>
       <w:pPr>
@@ -5641,6 +6191,72 @@
       </w:r>
     </w:p>
     <w:p>
+      <w:pPr>
+        <w:pStyle w:val="BodyText"/>
+      </w:pPr>
+      <w:r>
+        <w:rPr>
+          <w:b/>
+          <w:bCs/>
+        </w:rPr>
+        <w:t xml:space="preserve">Papic media lifecycle (2026-07-17).</w:t>
+      </w:r>
+      <w:r>
+        <w:t xml:space="preserve"> </w:t>
+      </w:r>
+      <w:r>
+        <w:t xml:space="preserve">Captured photos and 5-second clips are kept at full resolution for</w:t>
+      </w:r>
+      <w:r>
+        <w:t xml:space="preserve"> </w:t>
+      </w:r>
+      <w:r>
+        <w:rPr>
+          <w:b/>
+          <w:bCs/>
+        </w:rPr>
+        <w:t xml:space="preserve">6 months</w:t>
+      </w:r>
+      <w:r>
+        <w:t xml:space="preserve"> </w:t>
+      </w:r>
+      <w:r>
+        <w:t xml:space="preserve">(for the couple to download or sync to their own Google Drive). After the window the full-res original is</w:t>
+      </w:r>
+      <w:r>
+        <w:t xml:space="preserve"> </w:t>
+      </w:r>
+      <w:r>
+        <w:rPr>
+          <w:b/>
+          <w:bCs/>
+        </w:rPr>
+        <w:t xml:space="preserve">dropped from Setnayan storage</w:t>
+      </w:r>
+      <w:r>
+        <w:t xml:space="preserve"> </w:t>
+      </w:r>
+      <w:r>
+        <w:t xml:space="preserve">unless the couple has synced it to their Drive; a</w:t>
+      </w:r>
+      <w:r>
+        <w:t xml:space="preserve"> </w:t>
+      </w:r>
+      <w:r>
+        <w:rPr>
+          <w:b/>
+          <w:bCs/>
+        </w:rPr>
+        <w:t xml:space="preserve">compressed web copy</w:t>
+      </w:r>
+      <w:r>
+        <w:t xml:space="preserve"> </w:t>
+      </w:r>
+      <w:r>
+        <w:t xml:space="preserve">(photos + compressed clip copies) is retained on the couple’s gallery indefinitely as the serving copy — so no media type carries an unbounded full-resolution tail. Optional facial-geometry vectors (ROPA 11) auto-expire per event at ~5 years; the account-level face profile is governed by account deletion, not this per-event clock. Papic Lite (ROPA 20) is photos-only and biometric-free.</w:t>
+      </w:r>
+    </w:p>
+    <w:p>
       <w:r>
         <w:pict>
           <v:rect style="width:0;height:1.5pt" o:hralign="center" o:hrstd="t" o:hr="t"/>
@@ -6266,6 +6882,190 @@
       </w:r>
       <w:r>
         <w:t xml:space="preserve">, flagged here for a future consent-instrumentation pass; and the dashboard data-minimization tightening in §8.</w:t>
+      </w:r>
+    </w:p>
+    <w:p>
+      <w:pPr>
+        <w:pStyle w:val="BodyText"/>
+      </w:pPr>
+      <w:r>
+        <w:rPr>
+          <w:b/>
+          <w:bCs/>
+        </w:rPr>
+        <w:t xml:space="preserve">Papic v3 (added 2026-07-17):</w:t>
+      </w:r>
+      <w:r>
+        <w:t xml:space="preserve"> </w:t>
+      </w:r>
+      <w:r>
+        <w:t xml:space="preserve">7.</w:t>
+      </w:r>
+      <w:r>
+        <w:t xml:space="preserve"> </w:t>
+      </w:r>
+      <w:r>
+        <w:rPr>
+          <w:b/>
+          <w:bCs/>
+        </w:rPr>
+        <w:t xml:space="preserve">Papic Lite public-launch gate (counsel + DPO) — blocking Lite only.</w:t>
+      </w:r>
+      <w:r>
+        <w:t xml:space="preserve"> </w:t>
+      </w:r>
+      <w:r>
+        <w:t xml:space="preserve">The open, public-QR photo pool (ROPA 20) is built but flag-OFF. Enabling it requires sign-off on: bystander/subject consent at QR-join; the</w:t>
+      </w:r>
+      <w:r>
+        <w:t xml:space="preserve"> </w:t>
+      </w:r>
+      <w:r>
+        <w:rPr>
+          <w:b/>
+          <w:bCs/>
+        </w:rPr>
+        <w:t xml:space="preserve">public takedown/complaint mechanism</w:t>
+      </w:r>
+      <w:r>
+        <w:t xml:space="preserve"> </w:t>
+      </w:r>
+      <w:r>
+        <w:t xml:space="preserve">that serves the erasure right absent face-search (Lite is biometric-free); a minors-in-crowd notice (concerts/reunions/tournaments); and a</w:t>
+      </w:r>
+      <w:r>
+        <w:t xml:space="preserve"> </w:t>
+      </w:r>
+      <w:r>
+        <w:rPr>
+          <w:b/>
+          <w:bCs/>
+        </w:rPr>
+        <w:t xml:space="preserve">CSAM known-hash matcher + mandatory-reporting</w:t>
+      </w:r>
+      <w:r>
+        <w:t xml:space="preserve"> </w:t>
+      </w:r>
+      <w:r>
+        <w:t xml:space="preserve">review before an anonymous public upload endpoint goes live. Wedding Papic is unaffected.</w:t>
+      </w:r>
+      <w:r>
+        <w:t xml:space="preserve"> </w:t>
+      </w:r>
+      <w:r>
+        <w:t xml:space="preserve">8.</w:t>
+      </w:r>
+      <w:r>
+        <w:t xml:space="preserve"> </w:t>
+      </w:r>
+      <w:r>
+        <w:rPr>
+          <w:b/>
+          <w:bCs/>
+        </w:rPr>
+        <w:t xml:space="preserve">Face-vector 5-year expiry (DPO).</w:t>
+      </w:r>
+      <w:r>
+        <w:t xml:space="preserve"> </w:t>
+      </w:r>
+      <w:r>
+        <w:t xml:space="preserve">Confirm the expiry anchor (event date vs enrolment) and whether the enrolment</w:t>
+      </w:r>
+      <w:r>
+        <w:t xml:space="preserve"> </w:t>
+      </w:r>
+      <w:r>
+        <w:rPr>
+          <w:b/>
+          <w:bCs/>
+        </w:rPr>
+        <w:t xml:space="preserve">selfie</w:t>
+      </w:r>
+      <w:r>
+        <w:t xml:space="preserve"> </w:t>
+      </w:r>
+      <w:r>
+        <w:t xml:space="preserve">biometric asset is purged at expiry or retained (default proposed: null the vector, retain the photo). Add the sweep to the Data Retention Schedule + Face-Vector DPIA.</w:t>
+      </w:r>
+      <w:r>
+        <w:t xml:space="preserve"> </w:t>
+      </w:r>
+      <w:r>
+        <w:t xml:space="preserve">9.</w:t>
+      </w:r>
+      <w:r>
+        <w:t xml:space="preserve"> </w:t>
+      </w:r>
+      <w:r>
+        <w:rPr>
+          <w:b/>
+          <w:bCs/>
+        </w:rPr>
+        <w:t xml:space="preserve">⚠ Security-statement reconciliation (before filing).</w:t>
+      </w:r>
+      <w:r>
+        <w:t xml:space="preserve"> </w:t>
+      </w:r>
+      <w:r>
+        <w:t xml:space="preserve">§8 states</w:t>
+      </w:r>
+      <w:r>
+        <w:t xml:space="preserve"> </w:t>
+      </w:r>
+      <w:r>
+        <w:t xml:space="preserve">“OAuth grants encrypted at rest,”</w:t>
+      </w:r>
+      <w:r>
+        <w:t xml:space="preserve"> </w:t>
+      </w:r>
+      <w:r>
+        <w:t xml:space="preserve">but the Papic build review found the Google-Drive</w:t>
+      </w:r>
+      <w:r>
+        <w:t xml:space="preserve"> </w:t>
+      </w:r>
+      <w:r>
+        <w:rPr>
+          <w:rStyle w:val="VerbatimChar"/>
+        </w:rPr>
+        <w:t xml:space="preserve">oauth_grants.refresh_token</w:t>
+      </w:r>
+      <w:r>
+        <w:t xml:space="preserve"> </w:t>
+      </w:r>
+      <w:r>
+        <w:t xml:space="preserve">/</w:t>
+      </w:r>
+      <w:r>
+        <w:t xml:space="preserve"> </w:t>
+      </w:r>
+      <w:r>
+        <w:rPr>
+          <w:rStyle w:val="VerbatimChar"/>
+        </w:rPr>
+        <w:t xml:space="preserve">access_token</w:t>
+      </w:r>
+      <w:r>
+        <w:t xml:space="preserve"> </w:t>
+      </w:r>
+      <w:r>
+        <w:t xml:space="preserve">stored</w:t>
+      </w:r>
+      <w:r>
+        <w:t xml:space="preserve"> </w:t>
+      </w:r>
+      <w:r>
+        <w:rPr>
+          <w:b/>
+          <w:bCs/>
+        </w:rPr>
+        <w:t xml:space="preserve">in plaintext</w:t>
+      </w:r>
+      <w:r>
+        <w:t xml:space="preserve"> </w:t>
+      </w:r>
+      <w:r>
+        <w:t xml:space="preserve">today. Either implement application-layer encryption to make the statement true, or correct §8 — a submission must not overstate a technical control.</w:t>
       </w:r>
     </w:p>
     <w:p>

</xml_diff>